<commit_message>
docs: add link to knowledge base
</commit_message>
<xml_diff>
--- a/docs/World Project Launch/shared-knowledge-base/7-WPL-contribution-shared-knowledge-base.docx
+++ b/docs/World Project Launch/shared-knowledge-base/7-WPL-contribution-shared-knowledge-base.docx
@@ -108,6 +108,240 @@
         </w:rPr>
         <w:t>/2026]</w:t>
       </w:r>
+    </w:p>
+    <w:p>
+      <w:pPr>
+        <w:rPr>
+          <w:b/>
+          <w:bCs/>
+        </w:rPr>
+      </w:pPr>
+      <w:r>
+        <w:rPr>
+          <w:b/>
+          <w:bCs/>
+        </w:rPr>
+        <w:t>Enlace al Repositorio Común</w:t>
+      </w:r>
+    </w:p>
+    <w:p>
+      <w:pPr>
+        <w:rPr>
+          <w:b/>
+          <w:bCs/>
+        </w:rPr>
+      </w:pPr>
+      <w:r>
+        <w:rPr>
+          <w:b/>
+          <w:bCs/>
+        </w:rPr>
+        <w:t>Enlace general</w:t>
+      </w:r>
+    </w:p>
+    <w:p>
+      <w:pPr>
+        <w:numPr>
+          <w:ilvl w:val="0"/>
+          <w:numId w:val="8"/>
+        </w:numPr>
+        <w:rPr>
+          <w:b/>
+          <w:bCs/>
+        </w:rPr>
+      </w:pPr>
+      <w:r>
+        <w:rPr>
+          <w:b/>
+          <w:bCs/>
+        </w:rPr>
+        <w:t>GitHub: </w:t>
+      </w:r>
+      <w:hyperlink r:id="rId5" w:history="1">
+        <w:r>
+          <w:rPr>
+            <w:rStyle w:val="Hipervnculo"/>
+            <w:b/>
+            <w:bCs/>
+          </w:rPr>
+          <w:t>https://github.com/AS</w:t>
+        </w:r>
+        <w:r>
+          <w:rPr>
+            <w:rStyle w:val="Hipervnculo"/>
+            <w:b/>
+            <w:bCs/>
+          </w:rPr>
+          <w:t>o</w:t>
+        </w:r>
+        <w:r>
+          <w:rPr>
+            <w:rStyle w:val="Hipervnculo"/>
+            <w:b/>
+            <w:bCs/>
+          </w:rPr>
+          <w:t>ult10/Knowledge-Base-Turno-De-Tarde-ISPP-25-26</w:t>
+        </w:r>
+      </w:hyperlink>
+    </w:p>
+    <w:p>
+      <w:pPr>
+        <w:numPr>
+          <w:ilvl w:val="0"/>
+          <w:numId w:val="8"/>
+        </w:numPr>
+        <w:rPr>
+          <w:b/>
+          <w:bCs/>
+        </w:rPr>
+      </w:pPr>
+      <w:r>
+        <w:rPr>
+          <w:b/>
+          <w:bCs/>
+        </w:rPr>
+        <w:t>Docusaurus: </w:t>
+      </w:r>
+      <w:hyperlink r:id="rId6" w:history="1">
+        <w:r>
+          <w:rPr>
+            <w:rStyle w:val="Hipervnculo"/>
+            <w:b/>
+            <w:bCs/>
+          </w:rPr>
+          <w:t>ht</w:t>
+        </w:r>
+        <w:r>
+          <w:rPr>
+            <w:rStyle w:val="Hipervnculo"/>
+            <w:b/>
+            <w:bCs/>
+          </w:rPr>
+          <w:t>t</w:t>
+        </w:r>
+        <w:r>
+          <w:rPr>
+            <w:rStyle w:val="Hipervnculo"/>
+            <w:b/>
+            <w:bCs/>
+          </w:rPr>
+          <w:t>ps://asoult10.github.io/Knowledge-Base-Turno-De-Tarde-ISPP-25-26/</w:t>
+        </w:r>
+      </w:hyperlink>
+    </w:p>
+    <w:p>
+      <w:pPr>
+        <w:rPr>
+          <w:b/>
+          <w:bCs/>
+        </w:rPr>
+      </w:pPr>
+      <w:r>
+        <w:rPr>
+          <w:b/>
+          <w:bCs/>
+        </w:rPr>
+        <w:t xml:space="preserve">Enlace a los aportes de </w:t>
+      </w:r>
+      <w:proofErr w:type="spellStart"/>
+      <w:r>
+        <w:rPr>
+          <w:b/>
+          <w:bCs/>
+        </w:rPr>
+        <w:t>NexUS</w:t>
+      </w:r>
+      <w:proofErr w:type="spellEnd"/>
+    </w:p>
+    <w:p>
+      <w:pPr>
+        <w:numPr>
+          <w:ilvl w:val="0"/>
+          <w:numId w:val="9"/>
+        </w:numPr>
+        <w:rPr>
+          <w:b/>
+          <w:bCs/>
+        </w:rPr>
+      </w:pPr>
+      <w:r>
+        <w:rPr>
+          <w:b/>
+          <w:bCs/>
+        </w:rPr>
+        <w:t>GitHub: </w:t>
+      </w:r>
+      <w:hyperlink r:id="rId7" w:history="1">
+        <w:r>
+          <w:rPr>
+            <w:rStyle w:val="Hipervnculo"/>
+            <w:b/>
+            <w:bCs/>
+          </w:rPr>
+          <w:t>https://github.com/AS</w:t>
+        </w:r>
+        <w:r>
+          <w:rPr>
+            <w:rStyle w:val="Hipervnculo"/>
+            <w:b/>
+            <w:bCs/>
+          </w:rPr>
+          <w:t>o</w:t>
+        </w:r>
+        <w:r>
+          <w:rPr>
+            <w:rStyle w:val="Hipervnculo"/>
+            <w:b/>
+            <w:bCs/>
+          </w:rPr>
+          <w:t>ult10/Knowledge-Base-Turno-De-Tarde-ISPP-25-26/tree/main/my-website/docs/group-7</w:t>
+        </w:r>
+      </w:hyperlink>
+    </w:p>
+    <w:p>
+      <w:pPr>
+        <w:numPr>
+          <w:ilvl w:val="0"/>
+          <w:numId w:val="9"/>
+        </w:numPr>
+        <w:rPr>
+          <w:b/>
+          <w:bCs/>
+        </w:rPr>
+      </w:pPr>
+      <w:r>
+        <w:rPr>
+          <w:b/>
+          <w:bCs/>
+        </w:rPr>
+        <w:t>Docusaurus: </w:t>
+      </w:r>
+      <w:hyperlink r:id="rId8" w:history="1">
+        <w:r>
+          <w:rPr>
+            <w:rStyle w:val="Hipervnculo"/>
+            <w:b/>
+            <w:bCs/>
+          </w:rPr>
+          <w:t>https://asoult10.github.io/Knowledge-Base-Turno-De-Tarde-ISPP-25-26/docs/category/grupo</w:t>
+        </w:r>
+        <w:r>
+          <w:rPr>
+            <w:rStyle w:val="Hipervnculo"/>
+            <w:b/>
+            <w:bCs/>
+          </w:rPr>
+          <w:t>-</w:t>
+        </w:r>
+        <w:r>
+          <w:rPr>
+            <w:rStyle w:val="Hipervnculo"/>
+            <w:b/>
+            <w:bCs/>
+          </w:rPr>
+          <w:t>7/</w:t>
+        </w:r>
+      </w:hyperlink>
     </w:p>
     <w:p>
       <w:pPr>
@@ -1139,6 +1373,7 @@
       </w:r>
       <w:proofErr w:type="spellStart"/>
       <w:r>
+        <w:lastRenderedPageBreak/>
         <w:t>consideran</w:t>
       </w:r>
       <w:proofErr w:type="spellEnd"/>
@@ -3649,7 +3884,6 @@
         <w:rPr>
           <w:b/>
         </w:rPr>
-        <w:lastRenderedPageBreak/>
         <w:t>Integrar</w:t>
       </w:r>
       <w:proofErr w:type="spellEnd"/>
@@ -4978,6 +5212,304 @@
     </w:lvl>
   </w:abstractNum>
   <w:abstractNum w:abstractNumId="3" w15:restartNumberingAfterBreak="0">
+    <w:nsid w:val="0F316F7A"/>
+    <w:multiLevelType w:val="multilevel"/>
+    <w:tmpl w:val="F76A2B22"/>
+    <w:lvl w:ilvl="0">
+      <w:start w:val="1"/>
+      <w:numFmt w:val="bullet"/>
+      <w:lvlText w:val=""/>
+      <w:lvlJc w:val="left"/>
+      <w:pPr>
+        <w:tabs>
+          <w:tab w:val="num" w:pos="720"/>
+        </w:tabs>
+        <w:ind w:left="720" w:hanging="360"/>
+      </w:pPr>
+      <w:rPr>
+        <w:rFonts w:ascii="Symbol" w:hAnsi="Symbol" w:hint="default"/>
+        <w:sz w:val="20"/>
+      </w:rPr>
+    </w:lvl>
+    <w:lvl w:ilvl="1" w:tentative="1">
+      <w:start w:val="1"/>
+      <w:numFmt w:val="bullet"/>
+      <w:lvlText w:val=""/>
+      <w:lvlJc w:val="left"/>
+      <w:pPr>
+        <w:tabs>
+          <w:tab w:val="num" w:pos="1440"/>
+        </w:tabs>
+        <w:ind w:left="1440" w:hanging="360"/>
+      </w:pPr>
+      <w:rPr>
+        <w:rFonts w:ascii="Symbol" w:hAnsi="Symbol" w:hint="default"/>
+        <w:sz w:val="20"/>
+      </w:rPr>
+    </w:lvl>
+    <w:lvl w:ilvl="2" w:tentative="1">
+      <w:start w:val="1"/>
+      <w:numFmt w:val="bullet"/>
+      <w:lvlText w:val=""/>
+      <w:lvlJc w:val="left"/>
+      <w:pPr>
+        <w:tabs>
+          <w:tab w:val="num" w:pos="2160"/>
+        </w:tabs>
+        <w:ind w:left="2160" w:hanging="360"/>
+      </w:pPr>
+      <w:rPr>
+        <w:rFonts w:ascii="Symbol" w:hAnsi="Symbol" w:hint="default"/>
+        <w:sz w:val="20"/>
+      </w:rPr>
+    </w:lvl>
+    <w:lvl w:ilvl="3" w:tentative="1">
+      <w:start w:val="1"/>
+      <w:numFmt w:val="bullet"/>
+      <w:lvlText w:val=""/>
+      <w:lvlJc w:val="left"/>
+      <w:pPr>
+        <w:tabs>
+          <w:tab w:val="num" w:pos="2880"/>
+        </w:tabs>
+        <w:ind w:left="2880" w:hanging="360"/>
+      </w:pPr>
+      <w:rPr>
+        <w:rFonts w:ascii="Symbol" w:hAnsi="Symbol" w:hint="default"/>
+        <w:sz w:val="20"/>
+      </w:rPr>
+    </w:lvl>
+    <w:lvl w:ilvl="4" w:tentative="1">
+      <w:start w:val="1"/>
+      <w:numFmt w:val="bullet"/>
+      <w:lvlText w:val=""/>
+      <w:lvlJc w:val="left"/>
+      <w:pPr>
+        <w:tabs>
+          <w:tab w:val="num" w:pos="3600"/>
+        </w:tabs>
+        <w:ind w:left="3600" w:hanging="360"/>
+      </w:pPr>
+      <w:rPr>
+        <w:rFonts w:ascii="Symbol" w:hAnsi="Symbol" w:hint="default"/>
+        <w:sz w:val="20"/>
+      </w:rPr>
+    </w:lvl>
+    <w:lvl w:ilvl="5" w:tentative="1">
+      <w:start w:val="1"/>
+      <w:numFmt w:val="bullet"/>
+      <w:lvlText w:val=""/>
+      <w:lvlJc w:val="left"/>
+      <w:pPr>
+        <w:tabs>
+          <w:tab w:val="num" w:pos="4320"/>
+        </w:tabs>
+        <w:ind w:left="4320" w:hanging="360"/>
+      </w:pPr>
+      <w:rPr>
+        <w:rFonts w:ascii="Symbol" w:hAnsi="Symbol" w:hint="default"/>
+        <w:sz w:val="20"/>
+      </w:rPr>
+    </w:lvl>
+    <w:lvl w:ilvl="6" w:tentative="1">
+      <w:start w:val="1"/>
+      <w:numFmt w:val="bullet"/>
+      <w:lvlText w:val=""/>
+      <w:lvlJc w:val="left"/>
+      <w:pPr>
+        <w:tabs>
+          <w:tab w:val="num" w:pos="5040"/>
+        </w:tabs>
+        <w:ind w:left="5040" w:hanging="360"/>
+      </w:pPr>
+      <w:rPr>
+        <w:rFonts w:ascii="Symbol" w:hAnsi="Symbol" w:hint="default"/>
+        <w:sz w:val="20"/>
+      </w:rPr>
+    </w:lvl>
+    <w:lvl w:ilvl="7" w:tentative="1">
+      <w:start w:val="1"/>
+      <w:numFmt w:val="bullet"/>
+      <w:lvlText w:val=""/>
+      <w:lvlJc w:val="left"/>
+      <w:pPr>
+        <w:tabs>
+          <w:tab w:val="num" w:pos="5760"/>
+        </w:tabs>
+        <w:ind w:left="5760" w:hanging="360"/>
+      </w:pPr>
+      <w:rPr>
+        <w:rFonts w:ascii="Symbol" w:hAnsi="Symbol" w:hint="default"/>
+        <w:sz w:val="20"/>
+      </w:rPr>
+    </w:lvl>
+    <w:lvl w:ilvl="8" w:tentative="1">
+      <w:start w:val="1"/>
+      <w:numFmt w:val="bullet"/>
+      <w:lvlText w:val=""/>
+      <w:lvlJc w:val="left"/>
+      <w:pPr>
+        <w:tabs>
+          <w:tab w:val="num" w:pos="6480"/>
+        </w:tabs>
+        <w:ind w:left="6480" w:hanging="360"/>
+      </w:pPr>
+      <w:rPr>
+        <w:rFonts w:ascii="Symbol" w:hAnsi="Symbol" w:hint="default"/>
+        <w:sz w:val="20"/>
+      </w:rPr>
+    </w:lvl>
+  </w:abstractNum>
+  <w:abstractNum w:abstractNumId="4" w15:restartNumberingAfterBreak="0">
+    <w:nsid w:val="1AF03147"/>
+    <w:multiLevelType w:val="multilevel"/>
+    <w:tmpl w:val="778A7DA2"/>
+    <w:lvl w:ilvl="0">
+      <w:start w:val="1"/>
+      <w:numFmt w:val="bullet"/>
+      <w:lvlText w:val=""/>
+      <w:lvlJc w:val="left"/>
+      <w:pPr>
+        <w:tabs>
+          <w:tab w:val="num" w:pos="720"/>
+        </w:tabs>
+        <w:ind w:left="720" w:hanging="360"/>
+      </w:pPr>
+      <w:rPr>
+        <w:rFonts w:ascii="Symbol" w:hAnsi="Symbol" w:hint="default"/>
+        <w:sz w:val="20"/>
+      </w:rPr>
+    </w:lvl>
+    <w:lvl w:ilvl="1" w:tentative="1">
+      <w:start w:val="1"/>
+      <w:numFmt w:val="bullet"/>
+      <w:lvlText w:val=""/>
+      <w:lvlJc w:val="left"/>
+      <w:pPr>
+        <w:tabs>
+          <w:tab w:val="num" w:pos="1440"/>
+        </w:tabs>
+        <w:ind w:left="1440" w:hanging="360"/>
+      </w:pPr>
+      <w:rPr>
+        <w:rFonts w:ascii="Symbol" w:hAnsi="Symbol" w:hint="default"/>
+        <w:sz w:val="20"/>
+      </w:rPr>
+    </w:lvl>
+    <w:lvl w:ilvl="2" w:tentative="1">
+      <w:start w:val="1"/>
+      <w:numFmt w:val="bullet"/>
+      <w:lvlText w:val=""/>
+      <w:lvlJc w:val="left"/>
+      <w:pPr>
+        <w:tabs>
+          <w:tab w:val="num" w:pos="2160"/>
+        </w:tabs>
+        <w:ind w:left="2160" w:hanging="360"/>
+      </w:pPr>
+      <w:rPr>
+        <w:rFonts w:ascii="Symbol" w:hAnsi="Symbol" w:hint="default"/>
+        <w:sz w:val="20"/>
+      </w:rPr>
+    </w:lvl>
+    <w:lvl w:ilvl="3" w:tentative="1">
+      <w:start w:val="1"/>
+      <w:numFmt w:val="bullet"/>
+      <w:lvlText w:val=""/>
+      <w:lvlJc w:val="left"/>
+      <w:pPr>
+        <w:tabs>
+          <w:tab w:val="num" w:pos="2880"/>
+        </w:tabs>
+        <w:ind w:left="2880" w:hanging="360"/>
+      </w:pPr>
+      <w:rPr>
+        <w:rFonts w:ascii="Symbol" w:hAnsi="Symbol" w:hint="default"/>
+        <w:sz w:val="20"/>
+      </w:rPr>
+    </w:lvl>
+    <w:lvl w:ilvl="4" w:tentative="1">
+      <w:start w:val="1"/>
+      <w:numFmt w:val="bullet"/>
+      <w:lvlText w:val=""/>
+      <w:lvlJc w:val="left"/>
+      <w:pPr>
+        <w:tabs>
+          <w:tab w:val="num" w:pos="3600"/>
+        </w:tabs>
+        <w:ind w:left="3600" w:hanging="360"/>
+      </w:pPr>
+      <w:rPr>
+        <w:rFonts w:ascii="Symbol" w:hAnsi="Symbol" w:hint="default"/>
+        <w:sz w:val="20"/>
+      </w:rPr>
+    </w:lvl>
+    <w:lvl w:ilvl="5" w:tentative="1">
+      <w:start w:val="1"/>
+      <w:numFmt w:val="bullet"/>
+      <w:lvlText w:val=""/>
+      <w:lvlJc w:val="left"/>
+      <w:pPr>
+        <w:tabs>
+          <w:tab w:val="num" w:pos="4320"/>
+        </w:tabs>
+        <w:ind w:left="4320" w:hanging="360"/>
+      </w:pPr>
+      <w:rPr>
+        <w:rFonts w:ascii="Symbol" w:hAnsi="Symbol" w:hint="default"/>
+        <w:sz w:val="20"/>
+      </w:rPr>
+    </w:lvl>
+    <w:lvl w:ilvl="6" w:tentative="1">
+      <w:start w:val="1"/>
+      <w:numFmt w:val="bullet"/>
+      <w:lvlText w:val=""/>
+      <w:lvlJc w:val="left"/>
+      <w:pPr>
+        <w:tabs>
+          <w:tab w:val="num" w:pos="5040"/>
+        </w:tabs>
+        <w:ind w:left="5040" w:hanging="360"/>
+      </w:pPr>
+      <w:rPr>
+        <w:rFonts w:ascii="Symbol" w:hAnsi="Symbol" w:hint="default"/>
+        <w:sz w:val="20"/>
+      </w:rPr>
+    </w:lvl>
+    <w:lvl w:ilvl="7" w:tentative="1">
+      <w:start w:val="1"/>
+      <w:numFmt w:val="bullet"/>
+      <w:lvlText w:val=""/>
+      <w:lvlJc w:val="left"/>
+      <w:pPr>
+        <w:tabs>
+          <w:tab w:val="num" w:pos="5760"/>
+        </w:tabs>
+        <w:ind w:left="5760" w:hanging="360"/>
+      </w:pPr>
+      <w:rPr>
+        <w:rFonts w:ascii="Symbol" w:hAnsi="Symbol" w:hint="default"/>
+        <w:sz w:val="20"/>
+      </w:rPr>
+    </w:lvl>
+    <w:lvl w:ilvl="8" w:tentative="1">
+      <w:start w:val="1"/>
+      <w:numFmt w:val="bullet"/>
+      <w:lvlText w:val=""/>
+      <w:lvlJc w:val="left"/>
+      <w:pPr>
+        <w:tabs>
+          <w:tab w:val="num" w:pos="6480"/>
+        </w:tabs>
+        <w:ind w:left="6480" w:hanging="360"/>
+      </w:pPr>
+      <w:rPr>
+        <w:rFonts w:ascii="Symbol" w:hAnsi="Symbol" w:hint="default"/>
+        <w:sz w:val="20"/>
+      </w:rPr>
+    </w:lvl>
+  </w:abstractNum>
+  <w:abstractNum w:abstractNumId="5" w15:restartNumberingAfterBreak="0">
     <w:nsid w:val="34475432"/>
     <w:multiLevelType w:val="multilevel"/>
     <w:tmpl w:val="A6860882"/>
@@ -5126,7 +5658,7 @@
       </w:rPr>
     </w:lvl>
   </w:abstractNum>
-  <w:abstractNum w:abstractNumId="4" w15:restartNumberingAfterBreak="0">
+  <w:abstractNum w:abstractNumId="6" w15:restartNumberingAfterBreak="0">
     <w:nsid w:val="4A7A753A"/>
     <w:multiLevelType w:val="hybridMultilevel"/>
     <w:tmpl w:val="E5245324"/>
@@ -5239,7 +5771,7 @@
       </w:rPr>
     </w:lvl>
   </w:abstractNum>
-  <w:abstractNum w:abstractNumId="5" w15:restartNumberingAfterBreak="0">
+  <w:abstractNum w:abstractNumId="7" w15:restartNumberingAfterBreak="0">
     <w:nsid w:val="5F14525C"/>
     <w:multiLevelType w:val="hybridMultilevel"/>
     <w:tmpl w:val="CF12A248"/>
@@ -5352,7 +5884,7 @@
       </w:rPr>
     </w:lvl>
   </w:abstractNum>
-  <w:abstractNum w:abstractNumId="6" w15:restartNumberingAfterBreak="0">
+  <w:abstractNum w:abstractNumId="8" w15:restartNumberingAfterBreak="0">
     <w:nsid w:val="7A5B3E0C"/>
     <w:multiLevelType w:val="multilevel"/>
     <w:tmpl w:val="216E0122"/>
@@ -5502,10 +6034,10 @@
     </w:lvl>
   </w:abstractNum>
   <w:num w:numId="1" w16cid:durableId="1513564542">
-    <w:abstractNumId w:val="3"/>
+    <w:abstractNumId w:val="5"/>
   </w:num>
   <w:num w:numId="2" w16cid:durableId="1741321576">
-    <w:abstractNumId w:val="6"/>
+    <w:abstractNumId w:val="8"/>
   </w:num>
   <w:num w:numId="3" w16cid:durableId="1745300323">
     <w:abstractNumId w:val="0"/>
@@ -5514,13 +6046,19 @@
     <w:abstractNumId w:val="1"/>
   </w:num>
   <w:num w:numId="5" w16cid:durableId="406615509">
-    <w:abstractNumId w:val="4"/>
+    <w:abstractNumId w:val="6"/>
   </w:num>
   <w:num w:numId="6" w16cid:durableId="1141388107">
     <w:abstractNumId w:val="2"/>
   </w:num>
   <w:num w:numId="7" w16cid:durableId="1548641602">
-    <w:abstractNumId w:val="5"/>
+    <w:abstractNumId w:val="7"/>
+  </w:num>
+  <w:num w:numId="8" w16cid:durableId="668102550">
+    <w:abstractNumId w:val="4"/>
+  </w:num>
+  <w:num w:numId="9" w16cid:durableId="71394997">
+    <w:abstractNumId w:val="3"/>
   </w:num>
 </w:numbering>
 </file>
@@ -6128,7 +6666,6 @@
   <w:style w:type="character" w:default="1" w:styleId="Fuentedeprrafopredeter">
     <w:name w:val="Default Paragraph Font"/>
     <w:uiPriority w:val="1"/>
-    <w:semiHidden/>
     <w:unhideWhenUsed/>
   </w:style>
   <w:style w:type="table" w:default="1" w:styleId="Tablanormal">
@@ -6480,6 +7017,41 @@
       <w:contextualSpacing/>
     </w:pPr>
   </w:style>
+  <w:style w:type="character" w:styleId="Hipervnculo">
+    <w:name w:val="Hyperlink"/>
+    <w:basedOn w:val="Fuentedeprrafopredeter"/>
+    <w:uiPriority w:val="99"/>
+    <w:unhideWhenUsed/>
+    <w:rsid w:val="0007661C"/>
+    <w:rPr>
+      <w:color w:val="467886" w:themeColor="hyperlink"/>
+      <w:u w:val="single"/>
+    </w:rPr>
+  </w:style>
+  <w:style w:type="character" w:styleId="Mencinsinresolver">
+    <w:name w:val="Unresolved Mention"/>
+    <w:basedOn w:val="Fuentedeprrafopredeter"/>
+    <w:uiPriority w:val="99"/>
+    <w:semiHidden/>
+    <w:unhideWhenUsed/>
+    <w:rsid w:val="0007661C"/>
+    <w:rPr>
+      <w:color w:val="605E5C"/>
+      <w:shd w:val="clear" w:color="auto" w:fill="E1DFDD"/>
+    </w:rPr>
+  </w:style>
+  <w:style w:type="character" w:styleId="Hipervnculovisitado">
+    <w:name w:val="FollowedHyperlink"/>
+    <w:basedOn w:val="Fuentedeprrafopredeter"/>
+    <w:uiPriority w:val="99"/>
+    <w:semiHidden/>
+    <w:unhideWhenUsed/>
+    <w:rsid w:val="0007661C"/>
+    <w:rPr>
+      <w:color w:val="96607D" w:themeColor="followedHyperlink"/>
+      <w:u w:val="single"/>
+    </w:rPr>
+  </w:style>
 </w:styles>
 </file>
 

</xml_diff>